<commit_message>
fix: rendering for tables with matching fields
</commit_message>
<xml_diff>
--- a/templates/invoice_template.docx
+++ b/templates/invoice_template.docx
@@ -39,6 +39,256 @@
         <w:t>}</w:t>
       </w:r>
     </w:p>
+    <w:p/>
+    <w:p/>
+    <w:tbl>
+      <w:tblPr>
+        <w:tblStyle w:val="PlainTable1"/>
+        <w:tblW w:w="0" w:type="auto"/>
+        <w:tblLook w:val="04A0" w:firstRow="1" w:lastRow="0" w:firstColumn="1" w:lastColumn="0" w:noHBand="0" w:noVBand="1"/>
+      </w:tblPr>
+      <w:tblGrid>
+        <w:gridCol w:w="2871"/>
+        <w:gridCol w:w="2023"/>
+        <w:gridCol w:w="2159"/>
+        <w:gridCol w:w="2297"/>
+      </w:tblGrid>
+      <w:tr>
+        <w:trPr>
+          <w:cnfStyle w:val="100000000000" w:firstRow="1" w:lastRow="0" w:firstColumn="0" w:lastColumn="0" w:oddVBand="0" w:evenVBand="0" w:oddHBand="0" w:evenHBand="0" w:firstRowFirstColumn="0" w:firstRowLastColumn="0" w:lastRowFirstColumn="0" w:lastRowLastColumn="0"/>
+        </w:trPr>
+        <w:tc>
+          <w:tcPr>
+            <w:cnfStyle w:val="001000000000" w:firstRow="0" w:lastRow="0" w:firstColumn="1" w:lastColumn="0" w:oddVBand="0" w:evenVBand="0" w:oddHBand="0" w:evenHBand="0" w:firstRowFirstColumn="0" w:firstRowLastColumn="0" w:lastRowFirstColumn="0" w:lastRowLastColumn="0"/>
+            <w:tcW w:w="2337" w:type="dxa"/>
+          </w:tcPr>
+          <w:p>
+            <w:r>
+              <w:t>Description</w:t>
+            </w:r>
+          </w:p>
+        </w:tc>
+        <w:tc>
+          <w:tcPr>
+            <w:tcW w:w="2337" w:type="dxa"/>
+          </w:tcPr>
+          <w:p>
+            <w:pPr>
+              <w:cnfStyle w:val="100000000000" w:firstRow="1" w:lastRow="0" w:firstColumn="0" w:lastColumn="0" w:oddVBand="0" w:evenVBand="0" w:oddHBand="0" w:evenHBand="0" w:firstRowFirstColumn="0" w:firstRowLastColumn="0" w:lastRowFirstColumn="0" w:lastRowLastColumn="0"/>
+            </w:pPr>
+            <w:r>
+              <w:t>Qty</w:t>
+            </w:r>
+          </w:p>
+        </w:tc>
+        <w:tc>
+          <w:tcPr>
+            <w:tcW w:w="2338" w:type="dxa"/>
+          </w:tcPr>
+          <w:p>
+            <w:pPr>
+              <w:cnfStyle w:val="100000000000" w:firstRow="1" w:lastRow="0" w:firstColumn="0" w:lastColumn="0" w:oddVBand="0" w:evenVBand="0" w:oddHBand="0" w:evenHBand="0" w:firstRowFirstColumn="0" w:firstRowLastColumn="0" w:lastRowFirstColumn="0" w:lastRowLastColumn="0"/>
+            </w:pPr>
+            <w:r>
+              <w:t>Unit Price</w:t>
+            </w:r>
+          </w:p>
+        </w:tc>
+        <w:tc>
+          <w:tcPr>
+            <w:tcW w:w="2338" w:type="dxa"/>
+          </w:tcPr>
+          <w:p>
+            <w:pPr>
+              <w:cnfStyle w:val="100000000000" w:firstRow="1" w:lastRow="0" w:firstColumn="0" w:lastColumn="0" w:oddVBand="0" w:evenVBand="0" w:oddHBand="0" w:evenHBand="0" w:firstRowFirstColumn="0" w:firstRowLastColumn="0" w:lastRowFirstColumn="0" w:lastRowLastColumn="0"/>
+            </w:pPr>
+            <w:r>
+              <w:t>Total</w:t>
+            </w:r>
+          </w:p>
+        </w:tc>
+      </w:tr>
+      <w:tr>
+        <w:trPr>
+          <w:cnfStyle w:val="000000100000" w:firstRow="0" w:lastRow="0" w:firstColumn="0" w:lastColumn="0" w:oddVBand="0" w:evenVBand="0" w:oddHBand="1" w:evenHBand="0" w:firstRowFirstColumn="0" w:firstRowLastColumn="0" w:lastRowFirstColumn="0" w:lastRowLastColumn="0"/>
+        </w:trPr>
+        <w:tc>
+          <w:tcPr>
+            <w:cnfStyle w:val="001000000000" w:firstRow="0" w:lastRow="0" w:firstColumn="1" w:lastColumn="0" w:oddVBand="0" w:evenVBand="0" w:oddHBand="0" w:evenHBand="0" w:firstRowFirstColumn="0" w:firstRowLastColumn="0" w:lastRowFirstColumn="0" w:lastRowLastColumn="0"/>
+            <w:tcW w:w="2337" w:type="dxa"/>
+          </w:tcPr>
+          <w:p>
+            <w:pPr>
+              <w:jc w:val="center"/>
+              <w:rPr>
+                <w:b w:val="0"/>
+                <w:bCs w:val="0"/>
+              </w:rPr>
+            </w:pPr>
+            <w:r>
+              <w:rPr>
+                <w:b w:val="0"/>
+                <w:bCs w:val="0"/>
+              </w:rPr>
+              <w:t>{#line_</w:t>
+            </w:r>
+            <w:proofErr w:type="gramStart"/>
+            <w:r>
+              <w:rPr>
+                <w:b w:val="0"/>
+                <w:bCs w:val="0"/>
+              </w:rPr>
+              <w:t>items}{</w:t>
+            </w:r>
+            <w:proofErr w:type="gramEnd"/>
+            <w:r>
+              <w:rPr>
+                <w:b w:val="0"/>
+                <w:bCs w:val="0"/>
+              </w:rPr>
+              <w:t>description}</w:t>
+            </w:r>
+          </w:p>
+        </w:tc>
+        <w:tc>
+          <w:tcPr>
+            <w:tcW w:w="2337" w:type="dxa"/>
+          </w:tcPr>
+          <w:p>
+            <w:pPr>
+              <w:cnfStyle w:val="000000100000" w:firstRow="0" w:lastRow="0" w:firstColumn="0" w:lastColumn="0" w:oddVBand="0" w:evenVBand="0" w:oddHBand="1" w:evenHBand="0" w:firstRowFirstColumn="0" w:firstRowLastColumn="0" w:lastRowFirstColumn="0" w:lastRowLastColumn="0"/>
+            </w:pPr>
+            <w:r>
+              <w:t>{qty}</w:t>
+            </w:r>
+          </w:p>
+        </w:tc>
+        <w:tc>
+          <w:tcPr>
+            <w:tcW w:w="2338" w:type="dxa"/>
+          </w:tcPr>
+          <w:p>
+            <w:pPr>
+              <w:cnfStyle w:val="000000100000" w:firstRow="0" w:lastRow="0" w:firstColumn="0" w:lastColumn="0" w:oddVBand="0" w:evenVBand="0" w:oddHBand="1" w:evenHBand="0" w:firstRowFirstColumn="0" w:firstRowLastColumn="0" w:lastRowFirstColumn="0" w:lastRowLastColumn="0"/>
+            </w:pPr>
+            <w:r>
+              <w:t>{</w:t>
+            </w:r>
+            <w:proofErr w:type="spellStart"/>
+            <w:r>
+              <w:t>unit_price</w:t>
+            </w:r>
+            <w:proofErr w:type="spellEnd"/>
+            <w:r>
+              <w:t>}</w:t>
+            </w:r>
+          </w:p>
+        </w:tc>
+        <w:tc>
+          <w:tcPr>
+            <w:tcW w:w="2338" w:type="dxa"/>
+          </w:tcPr>
+          <w:p>
+            <w:pPr>
+              <w:cnfStyle w:val="000000100000" w:firstRow="0" w:lastRow="0" w:firstColumn="0" w:lastColumn="0" w:oddVBand="0" w:evenVBand="0" w:oddHBand="1" w:evenHBand="0" w:firstRowFirstColumn="0" w:firstRowLastColumn="0" w:lastRowFirstColumn="0" w:lastRowLastColumn="0"/>
+            </w:pPr>
+            <w:r>
+              <w:t>{total}{/</w:t>
+            </w:r>
+            <w:proofErr w:type="spellStart"/>
+            <w:r>
+              <w:t>line_items</w:t>
+            </w:r>
+            <w:proofErr w:type="spellEnd"/>
+            <w:r>
+              <w:t>}</w:t>
+            </w:r>
+          </w:p>
+        </w:tc>
+      </w:tr>
+      <w:tr>
+        <w:tc>
+          <w:tcPr>
+            <w:cnfStyle w:val="001000000000" w:firstRow="0" w:lastRow="0" w:firstColumn="1" w:lastColumn="0" w:oddVBand="0" w:evenVBand="0" w:oddHBand="0" w:evenHBand="0" w:firstRowFirstColumn="0" w:firstRowLastColumn="0" w:lastRowFirstColumn="0" w:lastRowLastColumn="0"/>
+            <w:tcW w:w="2337" w:type="dxa"/>
+          </w:tcPr>
+          <w:p/>
+        </w:tc>
+        <w:tc>
+          <w:tcPr>
+            <w:tcW w:w="2337" w:type="dxa"/>
+          </w:tcPr>
+          <w:p>
+            <w:pPr>
+              <w:cnfStyle w:val="000000000000" w:firstRow="0" w:lastRow="0" w:firstColumn="0" w:lastColumn="0" w:oddVBand="0" w:evenVBand="0" w:oddHBand="0" w:evenHBand="0" w:firstRowFirstColumn="0" w:firstRowLastColumn="0" w:lastRowFirstColumn="0" w:lastRowLastColumn="0"/>
+            </w:pPr>
+          </w:p>
+        </w:tc>
+        <w:tc>
+          <w:tcPr>
+            <w:tcW w:w="2338" w:type="dxa"/>
+          </w:tcPr>
+          <w:p>
+            <w:pPr>
+              <w:cnfStyle w:val="000000000000" w:firstRow="0" w:lastRow="0" w:firstColumn="0" w:lastColumn="0" w:oddVBand="0" w:evenVBand="0" w:oddHBand="0" w:evenHBand="0" w:firstRowFirstColumn="0" w:firstRowLastColumn="0" w:lastRowFirstColumn="0" w:lastRowLastColumn="0"/>
+            </w:pPr>
+          </w:p>
+        </w:tc>
+        <w:tc>
+          <w:tcPr>
+            <w:tcW w:w="2338" w:type="dxa"/>
+          </w:tcPr>
+          <w:p>
+            <w:pPr>
+              <w:cnfStyle w:val="000000000000" w:firstRow="0" w:lastRow="0" w:firstColumn="0" w:lastColumn="0" w:oddVBand="0" w:evenVBand="0" w:oddHBand="0" w:evenHBand="0" w:firstRowFirstColumn="0" w:firstRowLastColumn="0" w:lastRowFirstColumn="0" w:lastRowLastColumn="0"/>
+            </w:pPr>
+          </w:p>
+        </w:tc>
+      </w:tr>
+      <w:tr>
+        <w:trPr>
+          <w:cnfStyle w:val="000000100000" w:firstRow="0" w:lastRow="0" w:firstColumn="0" w:lastColumn="0" w:oddVBand="0" w:evenVBand="0" w:oddHBand="1" w:evenHBand="0" w:firstRowFirstColumn="0" w:firstRowLastColumn="0" w:lastRowFirstColumn="0" w:lastRowLastColumn="0"/>
+        </w:trPr>
+        <w:tc>
+          <w:tcPr>
+            <w:cnfStyle w:val="001000000000" w:firstRow="0" w:lastRow="0" w:firstColumn="1" w:lastColumn="0" w:oddVBand="0" w:evenVBand="0" w:oddHBand="0" w:evenHBand="0" w:firstRowFirstColumn="0" w:firstRowLastColumn="0" w:lastRowFirstColumn="0" w:lastRowLastColumn="0"/>
+            <w:tcW w:w="2337" w:type="dxa"/>
+          </w:tcPr>
+          <w:p/>
+        </w:tc>
+        <w:tc>
+          <w:tcPr>
+            <w:tcW w:w="2337" w:type="dxa"/>
+          </w:tcPr>
+          <w:p>
+            <w:pPr>
+              <w:cnfStyle w:val="000000100000" w:firstRow="0" w:lastRow="0" w:firstColumn="0" w:lastColumn="0" w:oddVBand="0" w:evenVBand="0" w:oddHBand="1" w:evenHBand="0" w:firstRowFirstColumn="0" w:firstRowLastColumn="0" w:lastRowFirstColumn="0" w:lastRowLastColumn="0"/>
+            </w:pPr>
+          </w:p>
+        </w:tc>
+        <w:tc>
+          <w:tcPr>
+            <w:tcW w:w="2338" w:type="dxa"/>
+          </w:tcPr>
+          <w:p>
+            <w:pPr>
+              <w:cnfStyle w:val="000000100000" w:firstRow="0" w:lastRow="0" w:firstColumn="0" w:lastColumn="0" w:oddVBand="0" w:evenVBand="0" w:oddHBand="1" w:evenHBand="0" w:firstRowFirstColumn="0" w:firstRowLastColumn="0" w:lastRowFirstColumn="0" w:lastRowLastColumn="0"/>
+            </w:pPr>
+          </w:p>
+        </w:tc>
+        <w:tc>
+          <w:tcPr>
+            <w:tcW w:w="2338" w:type="dxa"/>
+          </w:tcPr>
+          <w:p>
+            <w:pPr>
+              <w:cnfStyle w:val="000000100000" w:firstRow="0" w:lastRow="0" w:firstColumn="0" w:lastColumn="0" w:oddVBand="0" w:evenVBand="0" w:oddHBand="1" w:evenHBand="0" w:firstRowFirstColumn="0" w:firstRowLastColumn="0" w:lastRowFirstColumn="0" w:lastRowLastColumn="0"/>
+            </w:pPr>
+          </w:p>
+        </w:tc>
+      </w:tr>
+    </w:tbl>
+    <w:p/>
     <w:sectPr>
       <w:pgSz w:w="12240" w:h="15840"/>
       <w:pgMar w:top="1440" w:right="1440" w:bottom="1440" w:left="1440" w:header="708" w:footer="708" w:gutter="0"/>
@@ -966,6 +1216,261 @@
       <w:spacing w:val="5"/>
     </w:rPr>
   </w:style>
+  <w:style w:type="table" w:styleId="TableGrid">
+    <w:name w:val="Table Grid"/>
+    <w:basedOn w:val="TableNormal"/>
+    <w:uiPriority w:val="39"/>
+    <w:rsid w:val="00B34607"/>
+    <w:pPr>
+      <w:spacing w:after="0" w:line="240" w:lineRule="auto"/>
+    </w:pPr>
+    <w:tblPr>
+      <w:tblBorders>
+        <w:top w:val="single" w:sz="4" w:space="0" w:color="auto"/>
+        <w:left w:val="single" w:sz="4" w:space="0" w:color="auto"/>
+        <w:bottom w:val="single" w:sz="4" w:space="0" w:color="auto"/>
+        <w:right w:val="single" w:sz="4" w:space="0" w:color="auto"/>
+        <w:insideH w:val="single" w:sz="4" w:space="0" w:color="auto"/>
+        <w:insideV w:val="single" w:sz="4" w:space="0" w:color="auto"/>
+      </w:tblBorders>
+    </w:tblPr>
+  </w:style>
+  <w:style w:type="table" w:styleId="PlainTable3">
+    <w:name w:val="Plain Table 3"/>
+    <w:basedOn w:val="TableNormal"/>
+    <w:uiPriority w:val="43"/>
+    <w:rsid w:val="00B34607"/>
+    <w:pPr>
+      <w:spacing w:after="0" w:line="240" w:lineRule="auto"/>
+    </w:pPr>
+    <w:tblPr>
+      <w:tblStyleRowBandSize w:val="1"/>
+      <w:tblStyleColBandSize w:val="1"/>
+    </w:tblPr>
+    <w:tblStylePr w:type="firstRow">
+      <w:rPr>
+        <w:b/>
+        <w:bCs/>
+        <w:caps/>
+      </w:rPr>
+      <w:tblPr/>
+      <w:tcPr>
+        <w:tcBorders>
+          <w:bottom w:val="single" w:sz="4" w:space="0" w:color="7F7F7F" w:themeColor="text1" w:themeTint="80"/>
+        </w:tcBorders>
+      </w:tcPr>
+    </w:tblStylePr>
+    <w:tblStylePr w:type="lastRow">
+      <w:rPr>
+        <w:b/>
+        <w:bCs/>
+        <w:caps/>
+      </w:rPr>
+      <w:tblPr/>
+      <w:tcPr>
+        <w:tcBorders>
+          <w:top w:val="nil"/>
+        </w:tcBorders>
+      </w:tcPr>
+    </w:tblStylePr>
+    <w:tblStylePr w:type="firstCol">
+      <w:rPr>
+        <w:b/>
+        <w:bCs/>
+        <w:caps/>
+      </w:rPr>
+      <w:tblPr/>
+      <w:tcPr>
+        <w:tcBorders>
+          <w:right w:val="single" w:sz="4" w:space="0" w:color="7F7F7F" w:themeColor="text1" w:themeTint="80"/>
+        </w:tcBorders>
+      </w:tcPr>
+    </w:tblStylePr>
+    <w:tblStylePr w:type="lastCol">
+      <w:rPr>
+        <w:b/>
+        <w:bCs/>
+        <w:caps/>
+      </w:rPr>
+      <w:tblPr/>
+      <w:tcPr>
+        <w:tcBorders>
+          <w:left w:val="nil"/>
+        </w:tcBorders>
+      </w:tcPr>
+    </w:tblStylePr>
+    <w:tblStylePr w:type="band1Vert">
+      <w:tblPr/>
+      <w:tcPr>
+        <w:shd w:val="clear" w:color="auto" w:fill="F2F2F2" w:themeFill="background1" w:themeFillShade="F2"/>
+      </w:tcPr>
+    </w:tblStylePr>
+    <w:tblStylePr w:type="band1Horz">
+      <w:tblPr/>
+      <w:tcPr>
+        <w:shd w:val="clear" w:color="auto" w:fill="F2F2F2" w:themeFill="background1" w:themeFillShade="F2"/>
+      </w:tcPr>
+    </w:tblStylePr>
+    <w:tblStylePr w:type="neCell">
+      <w:tblPr/>
+      <w:tcPr>
+        <w:tcBorders>
+          <w:left w:val="nil"/>
+        </w:tcBorders>
+      </w:tcPr>
+    </w:tblStylePr>
+    <w:tblStylePr w:type="nwCell">
+      <w:tblPr/>
+      <w:tcPr>
+        <w:tcBorders>
+          <w:right w:val="nil"/>
+        </w:tcBorders>
+      </w:tcPr>
+    </w:tblStylePr>
+  </w:style>
+  <w:style w:type="table" w:styleId="PlainTable2">
+    <w:name w:val="Plain Table 2"/>
+    <w:basedOn w:val="TableNormal"/>
+    <w:uiPriority w:val="42"/>
+    <w:rsid w:val="00B34607"/>
+    <w:pPr>
+      <w:spacing w:after="0" w:line="240" w:lineRule="auto"/>
+    </w:pPr>
+    <w:tblPr>
+      <w:tblStyleRowBandSize w:val="1"/>
+      <w:tblStyleColBandSize w:val="1"/>
+      <w:tblBorders>
+        <w:top w:val="single" w:sz="4" w:space="0" w:color="7F7F7F" w:themeColor="text1" w:themeTint="80"/>
+        <w:bottom w:val="single" w:sz="4" w:space="0" w:color="7F7F7F" w:themeColor="text1" w:themeTint="80"/>
+      </w:tblBorders>
+    </w:tblPr>
+    <w:tblStylePr w:type="firstRow">
+      <w:rPr>
+        <w:b/>
+        <w:bCs/>
+      </w:rPr>
+      <w:tblPr/>
+      <w:tcPr>
+        <w:tcBorders>
+          <w:bottom w:val="single" w:sz="4" w:space="0" w:color="7F7F7F" w:themeColor="text1" w:themeTint="80"/>
+        </w:tcBorders>
+      </w:tcPr>
+    </w:tblStylePr>
+    <w:tblStylePr w:type="lastRow">
+      <w:rPr>
+        <w:b/>
+        <w:bCs/>
+      </w:rPr>
+      <w:tblPr/>
+      <w:tcPr>
+        <w:tcBorders>
+          <w:top w:val="single" w:sz="4" w:space="0" w:color="7F7F7F" w:themeColor="text1" w:themeTint="80"/>
+        </w:tcBorders>
+      </w:tcPr>
+    </w:tblStylePr>
+    <w:tblStylePr w:type="firstCol">
+      <w:rPr>
+        <w:b/>
+        <w:bCs/>
+      </w:rPr>
+    </w:tblStylePr>
+    <w:tblStylePr w:type="lastCol">
+      <w:rPr>
+        <w:b/>
+        <w:bCs/>
+      </w:rPr>
+    </w:tblStylePr>
+    <w:tblStylePr w:type="band1Vert">
+      <w:tblPr/>
+      <w:tcPr>
+        <w:tcBorders>
+          <w:left w:val="single" w:sz="4" w:space="0" w:color="7F7F7F" w:themeColor="text1" w:themeTint="80"/>
+          <w:right w:val="single" w:sz="4" w:space="0" w:color="7F7F7F" w:themeColor="text1" w:themeTint="80"/>
+        </w:tcBorders>
+      </w:tcPr>
+    </w:tblStylePr>
+    <w:tblStylePr w:type="band2Vert">
+      <w:tblPr/>
+      <w:tcPr>
+        <w:tcBorders>
+          <w:left w:val="single" w:sz="4" w:space="0" w:color="7F7F7F" w:themeColor="text1" w:themeTint="80"/>
+          <w:right w:val="single" w:sz="4" w:space="0" w:color="7F7F7F" w:themeColor="text1" w:themeTint="80"/>
+        </w:tcBorders>
+      </w:tcPr>
+    </w:tblStylePr>
+    <w:tblStylePr w:type="band1Horz">
+      <w:tblPr/>
+      <w:tcPr>
+        <w:tcBorders>
+          <w:top w:val="single" w:sz="4" w:space="0" w:color="7F7F7F" w:themeColor="text1" w:themeTint="80"/>
+          <w:bottom w:val="single" w:sz="4" w:space="0" w:color="7F7F7F" w:themeColor="text1" w:themeTint="80"/>
+        </w:tcBorders>
+      </w:tcPr>
+    </w:tblStylePr>
+  </w:style>
+  <w:style w:type="table" w:styleId="PlainTable1">
+    <w:name w:val="Plain Table 1"/>
+    <w:basedOn w:val="TableNormal"/>
+    <w:uiPriority w:val="41"/>
+    <w:rsid w:val="00B34607"/>
+    <w:pPr>
+      <w:spacing w:after="0" w:line="240" w:lineRule="auto"/>
+    </w:pPr>
+    <w:tblPr>
+      <w:tblStyleRowBandSize w:val="1"/>
+      <w:tblStyleColBandSize w:val="1"/>
+      <w:tblBorders>
+        <w:top w:val="single" w:sz="4" w:space="0" w:color="BFBFBF" w:themeColor="background1" w:themeShade="BF"/>
+        <w:left w:val="single" w:sz="4" w:space="0" w:color="BFBFBF" w:themeColor="background1" w:themeShade="BF"/>
+        <w:bottom w:val="single" w:sz="4" w:space="0" w:color="BFBFBF" w:themeColor="background1" w:themeShade="BF"/>
+        <w:right w:val="single" w:sz="4" w:space="0" w:color="BFBFBF" w:themeColor="background1" w:themeShade="BF"/>
+        <w:insideH w:val="single" w:sz="4" w:space="0" w:color="BFBFBF" w:themeColor="background1" w:themeShade="BF"/>
+        <w:insideV w:val="single" w:sz="4" w:space="0" w:color="BFBFBF" w:themeColor="background1" w:themeShade="BF"/>
+      </w:tblBorders>
+    </w:tblPr>
+    <w:tblStylePr w:type="firstRow">
+      <w:rPr>
+        <w:b/>
+        <w:bCs/>
+      </w:rPr>
+    </w:tblStylePr>
+    <w:tblStylePr w:type="lastRow">
+      <w:rPr>
+        <w:b/>
+        <w:bCs/>
+      </w:rPr>
+      <w:tblPr/>
+      <w:tcPr>
+        <w:tcBorders>
+          <w:top w:val="double" w:sz="4" w:space="0" w:color="BFBFBF" w:themeColor="background1" w:themeShade="BF"/>
+        </w:tcBorders>
+      </w:tcPr>
+    </w:tblStylePr>
+    <w:tblStylePr w:type="firstCol">
+      <w:rPr>
+        <w:b/>
+        <w:bCs/>
+      </w:rPr>
+    </w:tblStylePr>
+    <w:tblStylePr w:type="lastCol">
+      <w:rPr>
+        <w:b/>
+        <w:bCs/>
+      </w:rPr>
+    </w:tblStylePr>
+    <w:tblStylePr w:type="band1Vert">
+      <w:tblPr/>
+      <w:tcPr>
+        <w:shd w:val="clear" w:color="auto" w:fill="F2F2F2" w:themeFill="background1" w:themeFillShade="F2"/>
+      </w:tcPr>
+    </w:tblStylePr>
+    <w:tblStylePr w:type="band1Horz">
+      <w:tblPr/>
+      <w:tcPr>
+        <w:shd w:val="clear" w:color="auto" w:fill="F2F2F2" w:themeFill="background1" w:themeFillShade="F2"/>
+      </w:tcPr>
+    </w:tblStylePr>
+  </w:style>
 </w:styles>
 </file>
 

</xml_diff>